<commit_message>
feat: simplify monthly NAV reporting workflow
</commit_message>
<xml_diff>
--- a/artifacts/sample-reports/XSQ_2026_Q1_Quarterly_Report.docx
+++ b/artifacts/sample-reports/XSQ_2026_Q1_Quarterly_Report.docx
@@ -69,7 +69,7 @@
           <w:color w:val="374655"/>
           <w:sz w:val="30"/>
         </w:rPr>
-        <w:t>2026 Q1 Quarterly Newsletter | MANU</w:t>
+        <w:t>2026 Q1</w:t>
       </w:r>
     </w:p>
     <w:p>
@@ -156,7 +156,7 @@
         <w:pStyle w:val="Heading1"/>
       </w:pPr>
       <w:r>
-        <w:t>Fund Performance - Net Quarterly Returns</w:t>
+        <w:t>Fund Performance (Net Quarterly Returns)</w:t>
       </w:r>
     </w:p>
     <w:tbl>
@@ -1138,7 +1138,7 @@
         <w:pStyle w:val="Heading1"/>
       </w:pPr>
       <w:r>
-        <w:t>NAV per Share</w:t>
+        <w:t>Fund Performance (Graph)</w:t>
       </w:r>
     </w:p>
     <w:p>
@@ -3021,7 +3021,7 @@
         <w:t xml:space="preserve">Calculation and provenance: </w:t>
       </w:r>
       <w:r>
-        <w:t>legacy_excel_v1 | Report ID 1 | Version 1 | Snapshot 2026-07-18T02:46:14.326213+00:00 | RFR MANUAL / MANUAL</w:t>
+        <w:t>legacy_excel_v1 | Report ID 1 | Version 1 | Snapshot 2026-07-20T04:27:57.947606+00:00 | RFR MANUAL / MANUAL</w:t>
       </w:r>
     </w:p>
     <w:sectPr>
@@ -3050,7 +3050,7 @@
         <w:color w:val="64707D"/>
         <w:sz w:val="16"/>
       </w:rPr>
-      <w:t xml:space="preserve">xsq | Report 1 | 2026 Q1 v1 | Generated 2026-07-18 02:46 UTC | Page </w:t>
+      <w:t xml:space="preserve">xsq | Report 1 | 2026 Q1 v1 | Generated 2026-07-20 04:27 UTC | Page </w:t>
     </w:r>
     <w:r>
       <w:rPr>
@@ -3079,7 +3079,7 @@
         <w:color w:val="64707D"/>
         <w:sz w:val="16"/>
       </w:rPr>
-      <w:t xml:space="preserve">xsq | Report 1 | 2026 Q1 v1 | Generated 2026-07-18 02:46 UTC | Page </w:t>
+      <w:t xml:space="preserve">xsq | Report 1 | 2026 Q1 v1 | Generated 2026-07-20 04:27 UTC | Page </w:t>
     </w:r>
     <w:r>
       <w:rPr>
@@ -3108,7 +3108,7 @@
         <w:color w:val="64707D"/>
         <w:sz w:val="16"/>
       </w:rPr>
-      <w:t xml:space="preserve">xsq | Report 1 | 2026 Q1 v1 | Generated 2026-07-18 02:46 UTC | Page </w:t>
+      <w:t xml:space="preserve">xsq | Report 1 | 2026 Q1 v1 | Generated 2026-07-20 04:27 UTC | Page </w:t>
     </w:r>
     <w:r>
       <w:rPr>

</xml_diff>